<commit_message>
fix(medical): auto-calculate room rent totals, add Marathi employee name & designation inputs, fix hard page breaks in template, and eliminate undefined values
</commit_message>
<xml_diff>
--- a/public/medical_form.docx
+++ b/public/medical_form.docx
@@ -3406,7 +3406,7 @@
           <w:cs/>
           <w:lang w:eastAsia="en-IN"/>
         </w:rPr>
-        <w:lastRenderedPageBreak/>
+        <w:br w:type="page"/>
         <w:t>परिशिष्ट १</w:t>
       </w:r>
     </w:p>
@@ -6388,7 +6388,7 @@
                 <w:cs/>
                 <w:lang w:eastAsia="en-IN"/>
               </w:rPr>
-              <w:lastRenderedPageBreak/>
+              <w:br w:type="page"/>
               <w:t>एखाद्या अन्य वैद्यकिय अधिका</w:t>
             </w:r>
             <w:r>
@@ -8461,7 +8461,7 @@
           <w:u w:val="single"/>
           <w:lang w:eastAsia="en-IN"/>
         </w:rPr>
-        <w:lastRenderedPageBreak/>
+        <w:br w:type="page"/>
         <w:t>CERTIFICATE FORM 'C'</w:t>
       </w:r>
     </w:p>
@@ -9828,7 +9828,7 @@
           <w:u w:val="single"/>
           <w:lang w:eastAsia="en-IN"/>
         </w:rPr>
-        <w:lastRenderedPageBreak/>
+        <w:br w:type="page"/>
         <w:t>CERTIFICATE FORM 'D'</w:t>
       </w:r>
     </w:p>
@@ -12678,7 +12678,7 @@
           <w:szCs w:val="24"/>
           <w:u w:val="single"/>
         </w:rPr>
-        <w:lastRenderedPageBreak/>
+        <w:br w:type="page"/>
         <w:t>PATHOLOGY</w:t>
       </w:r>
       <w:r>
@@ -13959,7 +13959,7 @@
           <w:szCs w:val="24"/>
           <w:u w:val="single"/>
         </w:rPr>
-        <w:lastRenderedPageBreak/>
+        <w:br w:type="page"/>
         <w:t>MEDICINE</w:t>
       </w:r>
       <w:r>
@@ -15267,7 +15267,7 @@
           <w:cs/>
           <w:lang w:bidi="hi-IN"/>
         </w:rPr>
-        <w:lastRenderedPageBreak/>
+        <w:br w:type="page"/>
         <w:t>रुग्णालयातील</w:t>
       </w:r>
       <w:r>
@@ -18428,7 +18428,7 @@
           <w:cs/>
           <w:lang w:eastAsia="en-IN"/>
         </w:rPr>
-        <w:lastRenderedPageBreak/>
+        <w:br w:type="page"/>
         <w:t xml:space="preserve">पती </w:t>
       </w:r>
       <w:r>
@@ -22493,7 +22493,7 @@
           <w:cs/>
           <w:lang w:eastAsia="en-IN"/>
         </w:rPr>
-        <w:lastRenderedPageBreak/>
+        <w:br w:type="page"/>
         <w:t>कुटुंबाचा तपशील</w:t>
       </w:r>
     </w:p>
@@ -24298,7 +24298,7 @@
           <w:u w:val="single"/>
           <w:lang w:val="en-US"/>
         </w:rPr>
-        <w:lastRenderedPageBreak/>
+        <w:br w:type="page"/>
         <w:t xml:space="preserve">EMERGENCY </w:t>
       </w:r>
       <w:r>
@@ -25233,7 +25233,7 @@
           <w:u w:val="single"/>
           <w:lang w:eastAsia="en-IN"/>
         </w:rPr>
-        <w:lastRenderedPageBreak/>
+        <w:br w:type="page"/>
         <w:t>Nursing Certificate</w:t>
       </w:r>
     </w:p>
@@ -26596,7 +26596,7 @@
           <w:u w:val="single"/>
           <w:cs/>
         </w:rPr>
-        <w:lastRenderedPageBreak/>
+        <w:br w:type="page"/>
         <w:t>प्रमाणपत्र</w:t>
       </w:r>
     </w:p>
@@ -28836,7 +28836,7 @@
           <w:u w:val="single"/>
           <w:cs/>
         </w:rPr>
-        <w:lastRenderedPageBreak/>
+        <w:br w:type="page"/>
         <w:t>वैद्यकीय</w:t>
       </w:r>
       <w:r>
@@ -31448,7 +31448,7 @@
           <w:szCs w:val="22"/>
           <w:lang w:eastAsia="en-IN"/>
         </w:rPr>
-        <w:lastRenderedPageBreak/>
+        <w:br w:type="page"/>
         <w:tab/>
       </w:r>
       <w:r>

</xml_diff>

<commit_message>
fix(medical): populate pathology and medicine receipt items in official PDF and remove blank pages
</commit_message>
<xml_diff>
--- a/public/medical_form.docx
+++ b/public/medical_form.docx
@@ -8433,7 +8433,6 @@
           <w:u w:val="single"/>
           <w:lang w:eastAsia="en-IN"/>
         </w:rPr>
-        <w:br w:type="page"/>
       </w:r>
     </w:p>
     <w:p>
@@ -9800,7 +9799,6 @@
           <w:u w:val="single"/>
           <w:lang w:eastAsia="en-IN"/>
         </w:rPr>
-        <w:br w:type="page"/>
       </w:r>
     </w:p>
     <w:p>
@@ -12667,7 +12665,6 @@
           <w:szCs w:val="24"/>
           <w:lang w:eastAsia="en-IN"/>
         </w:rPr>
-        <w:br w:type="page"/>
       </w:r>
       <w:r>
         <w:rPr>
@@ -13933,7 +13930,6 @@
           <w:szCs w:val="24"/>
           <w:lang w:val="en-US" w:eastAsia="en-IN"/>
         </w:rPr>
-        <w:br w:type="page"/>
       </w:r>
     </w:p>
     <w:p>
@@ -15238,7 +15234,6 @@
           <w:szCs w:val="24"/>
           <w:lang w:val="en-US" w:eastAsia="en-IN"/>
         </w:rPr>
-        <w:br w:type="page"/>
       </w:r>
     </w:p>
     <w:p>
@@ -18415,7 +18410,6 @@
           <w:u w:val="single"/>
           <w:lang w:eastAsia="en-IN"/>
         </w:rPr>
-        <w:br w:type="page"/>
       </w:r>
       <w:r>
         <w:rPr>
@@ -22464,7 +22458,6 @@
           <w:szCs w:val="28"/>
           <w:lang w:eastAsia="en-IN"/>
         </w:rPr>
-        <w:br w:type="page"/>
       </w:r>
     </w:p>
     <w:p>
@@ -24269,7 +24262,6 @@
           <w:u w:val="single"/>
           <w:lang w:val="en-US"/>
         </w:rPr>
-        <w:br w:type="page"/>
       </w:r>
     </w:p>
     <w:p>
@@ -25211,7 +25203,6 @@
           <w:u w:val="single"/>
           <w:lang w:eastAsia="en-IN"/>
         </w:rPr>
-        <w:br w:type="page"/>
       </w:r>
     </w:p>
     <w:p>
@@ -26574,7 +26565,6 @@
           <w:szCs w:val="24"/>
           <w:lang w:eastAsia="en-IN"/>
         </w:rPr>
-        <w:br w:type="page"/>
       </w:r>
     </w:p>
     <w:p>
@@ -31429,7 +31419,6 @@
           <w:szCs w:val="22"/>
           <w:lang w:eastAsia="en-IN"/>
         </w:rPr>
-        <w:br w:type="page"/>
       </w:r>
     </w:p>
     <w:p>

</xml_diff>